<commit_message>
Organização do PDF de pré-compra
</commit_message>
<xml_diff>
--- a/backend/assets/pre-compra/formulario_cotacao.docx
+++ b/backend/assets/pre-compra/formulario_cotacao.docx
@@ -19,8 +19,8 @@
       </w:tblPr>
       <w:tblGrid>
         <w:gridCol w:w="1128"/>
-        <w:gridCol w:w="427"/>
-        <w:gridCol w:w="401"/>
+        <w:gridCol w:w="710"/>
+        <w:gridCol w:w="118"/>
         <w:gridCol w:w="2717"/>
         <w:gridCol w:w="709"/>
         <w:gridCol w:w="709"/>
@@ -81,7 +81,7 @@
         </w:trPr>
         <w:tc>
           <w:tcPr>
-            <w:tcW w:w="1555" w:type="dxa"/>
+            <w:tcW w:w="1838" w:type="dxa"/>
             <w:gridSpan w:val="2"/>
             <w:vAlign w:val="center"/>
           </w:tcPr>
@@ -110,7 +110,36 @@
                 <w:sz w:val="18"/>
                 <w:szCs w:val="18"/>
               </w:rPr>
-              <w:t>a cotação</w:t>
+              <w:t>a</w:t>
+            </w:r>
+            <w:r>
+              <w:rPr>
+                <w:rFonts w:ascii="Arial" w:hAnsi="Arial" w:cs="Arial"/>
+                <w:b/>
+                <w:sz w:val="18"/>
+                <w:szCs w:val="18"/>
+              </w:rPr>
+              <w:t xml:space="preserve"> </w:t>
+            </w:r>
+            <w:proofErr w:type="spellStart"/>
+            <w:r>
+              <w:rPr>
+                <w:rFonts w:ascii="Arial" w:hAnsi="Arial" w:cs="Arial"/>
+                <w:b/>
+                <w:sz w:val="18"/>
+                <w:szCs w:val="18"/>
+              </w:rPr>
+              <w:t>pré</w:t>
+            </w:r>
+            <w:proofErr w:type="spellEnd"/>
+            <w:r>
+              <w:rPr>
+                <w:rFonts w:ascii="Arial" w:hAnsi="Arial" w:cs="Arial"/>
+                <w:b/>
+                <w:sz w:val="18"/>
+                <w:szCs w:val="18"/>
+              </w:rPr>
+              <w:t>-compra</w:t>
             </w:r>
             <w:r>
               <w:rPr>
@@ -125,7 +154,7 @@
         </w:tc>
         <w:tc>
           <w:tcPr>
-            <w:tcW w:w="3118" w:type="dxa"/>
+            <w:tcW w:w="2835" w:type="dxa"/>
             <w:gridSpan w:val="2"/>
             <w:vAlign w:val="center"/>
           </w:tcPr>
@@ -136,6 +165,7 @@
                 <w:b/>
                 <w:sz w:val="18"/>
                 <w:szCs w:val="18"/>
+                <w:u w:val="single"/>
               </w:rPr>
             </w:pPr>
           </w:p>
@@ -254,7 +284,7 @@
         </w:trPr>
         <w:tc>
           <w:tcPr>
-            <w:tcW w:w="1555" w:type="dxa"/>
+            <w:tcW w:w="1838" w:type="dxa"/>
             <w:gridSpan w:val="2"/>
             <w:vAlign w:val="center"/>
           </w:tcPr>
@@ -280,7 +310,7 @@
         </w:tc>
         <w:tc>
           <w:tcPr>
-            <w:tcW w:w="5103" w:type="dxa"/>
+            <w:tcW w:w="4820" w:type="dxa"/>
             <w:gridSpan w:val="5"/>
             <w:vAlign w:val="center"/>
           </w:tcPr>
@@ -361,7 +391,7 @@
         </w:trPr>
         <w:tc>
           <w:tcPr>
-            <w:tcW w:w="1555" w:type="dxa"/>
+            <w:tcW w:w="1838" w:type="dxa"/>
             <w:gridSpan w:val="2"/>
             <w:tcBorders>
               <w:bottom w:val="single" w:sz="4" w:space="0" w:color="auto"/>
@@ -390,7 +420,7 @@
         </w:tc>
         <w:tc>
           <w:tcPr>
-            <w:tcW w:w="5103" w:type="dxa"/>
+            <w:tcW w:w="4820" w:type="dxa"/>
             <w:gridSpan w:val="5"/>
             <w:tcBorders>
               <w:bottom w:val="single" w:sz="4" w:space="0" w:color="auto"/>
@@ -481,7 +511,7 @@
         </w:trPr>
         <w:tc>
           <w:tcPr>
-            <w:tcW w:w="1555" w:type="dxa"/>
+            <w:tcW w:w="1838" w:type="dxa"/>
             <w:gridSpan w:val="2"/>
             <w:tcBorders>
               <w:bottom w:val="single" w:sz="4" w:space="0" w:color="auto"/>
@@ -519,7 +549,7 @@
         </w:tc>
         <w:tc>
           <w:tcPr>
-            <w:tcW w:w="5103" w:type="dxa"/>
+            <w:tcW w:w="4820" w:type="dxa"/>
             <w:gridSpan w:val="5"/>
             <w:tcBorders>
               <w:bottom w:val="single" w:sz="4" w:space="0" w:color="auto"/>
@@ -614,7 +644,7 @@
         </w:trPr>
         <w:tc>
           <w:tcPr>
-            <w:tcW w:w="1555" w:type="dxa"/>
+            <w:tcW w:w="1838" w:type="dxa"/>
             <w:gridSpan w:val="2"/>
             <w:tcBorders>
               <w:top w:val="single" w:sz="4" w:space="0" w:color="auto"/>
@@ -637,7 +667,7 @@
         </w:tc>
         <w:tc>
           <w:tcPr>
-            <w:tcW w:w="5103" w:type="dxa"/>
+            <w:tcW w:w="4820" w:type="dxa"/>
             <w:gridSpan w:val="5"/>
             <w:tcBorders>
               <w:top w:val="single" w:sz="4" w:space="0" w:color="auto"/>

</xml_diff>

<commit_message>
Mudança no PDF de pré-compra para inserir frete
</commit_message>
<xml_diff>
--- a/backend/assets/pre-compra/formulario_cotacao.docx
+++ b/backend/assets/pre-compra/formulario_cotacao.docx
@@ -27,7 +27,8 @@
         <w:gridCol w:w="567"/>
         <w:gridCol w:w="992"/>
         <w:gridCol w:w="142"/>
-        <w:gridCol w:w="1275"/>
+        <w:gridCol w:w="1134"/>
+        <w:gridCol w:w="141"/>
         <w:gridCol w:w="142"/>
         <w:gridCol w:w="851"/>
         <w:gridCol w:w="1559"/>
@@ -39,7 +40,7 @@
         <w:tc>
           <w:tcPr>
             <w:tcW w:w="11619" w:type="dxa"/>
-            <w:gridSpan w:val="13"/>
+            <w:gridSpan w:val="14"/>
             <w:shd w:val="clear" w:color="auto" w:fill="D9D9D9"/>
             <w:vAlign w:val="center"/>
           </w:tcPr>
@@ -216,7 +217,7 @@
         <w:tc>
           <w:tcPr>
             <w:tcW w:w="1417" w:type="dxa"/>
-            <w:gridSpan w:val="2"/>
+            <w:gridSpan w:val="3"/>
             <w:vAlign w:val="center"/>
           </w:tcPr>
           <w:p>
@@ -341,7 +342,7 @@
         <w:tc>
           <w:tcPr>
             <w:tcW w:w="2409" w:type="dxa"/>
-            <w:gridSpan w:val="3"/>
+            <w:gridSpan w:val="4"/>
             <w:vAlign w:val="center"/>
           </w:tcPr>
           <w:p>
@@ -486,7 +487,7 @@
         <w:tc>
           <w:tcPr>
             <w:tcW w:w="3969" w:type="dxa"/>
-            <w:gridSpan w:val="5"/>
+            <w:gridSpan w:val="6"/>
             <w:tcBorders>
               <w:bottom w:val="single" w:sz="4" w:space="0" w:color="auto"/>
             </w:tcBorders>
@@ -619,7 +620,7 @@
         <w:tc>
           <w:tcPr>
             <w:tcW w:w="3969" w:type="dxa"/>
-            <w:gridSpan w:val="5"/>
+            <w:gridSpan w:val="6"/>
             <w:tcBorders>
               <w:bottom w:val="single" w:sz="4" w:space="0" w:color="auto"/>
             </w:tcBorders>
@@ -715,7 +716,7 @@
         <w:tc>
           <w:tcPr>
             <w:tcW w:w="3969" w:type="dxa"/>
-            <w:gridSpan w:val="5"/>
+            <w:gridSpan w:val="6"/>
             <w:tcBorders>
               <w:top w:val="single" w:sz="4" w:space="0" w:color="auto"/>
               <w:left w:val="nil"/>
@@ -744,7 +745,7 @@
         <w:tc>
           <w:tcPr>
             <w:tcW w:w="11619" w:type="dxa"/>
-            <w:gridSpan w:val="13"/>
+            <w:gridSpan w:val="14"/>
             <w:tcBorders>
               <w:top w:val="single" w:sz="4" w:space="0" w:color="auto"/>
             </w:tcBorders>
@@ -809,28 +810,28 @@
               <w:rPr>
                 <w:rFonts w:ascii="Arial" w:hAnsi="Arial" w:cs="Arial"/>
                 <w:b/>
-                <w:sz w:val="16"/>
-                <w:szCs w:val="16"/>
-              </w:rPr>
-            </w:pPr>
-            <w:r>
-              <w:rPr>
-                <w:rFonts w:ascii="Arial" w:hAnsi="Arial" w:cs="Arial"/>
-                <w:b/>
-                <w:sz w:val="16"/>
-                <w:szCs w:val="16"/>
-              </w:rPr>
-              <w:t>Código</w:t>
-            </w:r>
-            <w:r>
-              <w:rPr>
-                <w:rFonts w:ascii="Arial" w:hAnsi="Arial" w:cs="Arial"/>
-                <w:b/>
-                <w:sz w:val="16"/>
-                <w:szCs w:val="16"/>
+                <w:sz w:val="15"/>
+                <w:szCs w:val="15"/>
+              </w:rPr>
+            </w:pPr>
+            <w:r>
+              <w:rPr>
+                <w:rFonts w:ascii="Arial" w:hAnsi="Arial" w:cs="Arial"/>
+                <w:b/>
+                <w:sz w:val="15"/>
+                <w:szCs w:val="15"/>
+              </w:rPr>
+              <w:t>CÓDIGO</w:t>
+            </w:r>
+            <w:r>
+              <w:rPr>
+                <w:rFonts w:ascii="Arial" w:hAnsi="Arial" w:cs="Arial"/>
+                <w:b/>
+                <w:sz w:val="15"/>
+                <w:szCs w:val="15"/>
               </w:rPr>
               <w:br/>
-              <w:t>Só Aço</w:t>
+              <w:t>SÓ AÇO</w:t>
             </w:r>
           </w:p>
         </w:tc>
@@ -848,47 +849,28 @@
               <w:rPr>
                 <w:rFonts w:ascii="Arial" w:hAnsi="Arial" w:cs="Arial"/>
                 <w:b/>
-                <w:sz w:val="16"/>
-                <w:szCs w:val="16"/>
-              </w:rPr>
-            </w:pPr>
-            <w:r>
-              <w:rPr>
-                <w:rFonts w:ascii="Arial" w:hAnsi="Arial" w:cs="Arial"/>
-                <w:b/>
-                <w:sz w:val="16"/>
-                <w:szCs w:val="16"/>
-              </w:rPr>
-              <w:t xml:space="preserve">Código </w:t>
-            </w:r>
-            <w:r>
-              <w:rPr>
-                <w:rFonts w:ascii="Arial" w:hAnsi="Arial" w:cs="Arial"/>
-                <w:b/>
-                <w:sz w:val="16"/>
-                <w:szCs w:val="16"/>
+                <w:sz w:val="15"/>
+                <w:szCs w:val="15"/>
+              </w:rPr>
+            </w:pPr>
+            <w:r>
+              <w:rPr>
+                <w:rFonts w:ascii="Arial" w:hAnsi="Arial" w:cs="Arial"/>
+                <w:b/>
+                <w:sz w:val="15"/>
+                <w:szCs w:val="15"/>
+              </w:rPr>
+              <w:t xml:space="preserve">CÓDIGO </w:t>
+            </w:r>
+            <w:r>
+              <w:rPr>
+                <w:rFonts w:ascii="Arial" w:hAnsi="Arial" w:cs="Arial"/>
+                <w:b/>
+                <w:sz w:val="15"/>
+                <w:szCs w:val="15"/>
               </w:rPr>
               <w:br/>
-            </w:r>
-            <w:proofErr w:type="spellStart"/>
-            <w:r>
-              <w:rPr>
-                <w:rFonts w:ascii="Arial" w:hAnsi="Arial" w:cs="Arial"/>
-                <w:b/>
-                <w:sz w:val="16"/>
-                <w:szCs w:val="16"/>
-              </w:rPr>
-              <w:t>Fornec</w:t>
-            </w:r>
-            <w:proofErr w:type="spellEnd"/>
-            <w:r>
-              <w:rPr>
-                <w:rFonts w:ascii="Arial" w:hAnsi="Arial" w:cs="Arial"/>
-                <w:b/>
-                <w:sz w:val="16"/>
-                <w:szCs w:val="16"/>
-              </w:rPr>
-              <w:t>.</w:t>
+              <w:t>FORNEC.</w:t>
             </w:r>
           </w:p>
         </w:tc>
@@ -906,16 +888,16 @@
               <w:rPr>
                 <w:rFonts w:ascii="Arial" w:hAnsi="Arial" w:cs="Arial"/>
                 <w:b/>
-                <w:sz w:val="16"/>
-                <w:szCs w:val="16"/>
-              </w:rPr>
-            </w:pPr>
-            <w:r>
-              <w:rPr>
-                <w:rFonts w:ascii="Arial" w:hAnsi="Arial" w:cs="Arial"/>
-                <w:b/>
-                <w:sz w:val="16"/>
-                <w:szCs w:val="16"/>
+                <w:sz w:val="15"/>
+                <w:szCs w:val="15"/>
+              </w:rPr>
+            </w:pPr>
+            <w:r>
+              <w:rPr>
+                <w:rFonts w:ascii="Arial" w:hAnsi="Arial" w:cs="Arial"/>
+                <w:b/>
+                <w:sz w:val="15"/>
+                <w:szCs w:val="15"/>
               </w:rPr>
               <w:t>PRODUTO</w:t>
             </w:r>
@@ -935,16 +917,16 @@
               <w:rPr>
                 <w:rFonts w:ascii="Arial" w:hAnsi="Arial" w:cs="Arial"/>
                 <w:b/>
-                <w:sz w:val="16"/>
-                <w:szCs w:val="16"/>
-              </w:rPr>
-            </w:pPr>
-            <w:r>
-              <w:rPr>
-                <w:rFonts w:ascii="Arial" w:hAnsi="Arial" w:cs="Arial"/>
-                <w:b/>
-                <w:sz w:val="16"/>
-                <w:szCs w:val="16"/>
+                <w:sz w:val="15"/>
+                <w:szCs w:val="15"/>
+              </w:rPr>
+            </w:pPr>
+            <w:r>
+              <w:rPr>
+                <w:rFonts w:ascii="Arial" w:hAnsi="Arial" w:cs="Arial"/>
+                <w:b/>
+                <w:sz w:val="15"/>
+                <w:szCs w:val="15"/>
               </w:rPr>
               <w:t>QNTD</w:t>
             </w:r>
@@ -964,16 +946,16 @@
               <w:rPr>
                 <w:rFonts w:ascii="Arial" w:hAnsi="Arial" w:cs="Arial"/>
                 <w:b/>
-                <w:sz w:val="16"/>
-                <w:szCs w:val="16"/>
-              </w:rPr>
-            </w:pPr>
-            <w:r>
-              <w:rPr>
-                <w:rFonts w:ascii="Arial" w:hAnsi="Arial" w:cs="Arial"/>
-                <w:b/>
-                <w:sz w:val="16"/>
-                <w:szCs w:val="16"/>
+                <w:sz w:val="15"/>
+                <w:szCs w:val="15"/>
+              </w:rPr>
+            </w:pPr>
+            <w:r>
+              <w:rPr>
+                <w:rFonts w:ascii="Arial" w:hAnsi="Arial" w:cs="Arial"/>
+                <w:b/>
+                <w:sz w:val="15"/>
+                <w:szCs w:val="15"/>
               </w:rPr>
               <w:t>U.M</w:t>
             </w:r>
@@ -981,7 +963,35 @@
         </w:tc>
         <w:tc>
           <w:tcPr>
-            <w:tcW w:w="2268" w:type="dxa"/>
+            <w:tcW w:w="1134" w:type="dxa"/>
+            <w:shd w:val="clear" w:color="auto" w:fill="F2F2F2" w:themeFill="background1" w:themeFillShade="F2"/>
+            <w:vAlign w:val="center"/>
+          </w:tcPr>
+          <w:p>
+            <w:pPr>
+              <w:ind w:left="-129"/>
+              <w:jc w:val="center"/>
+              <w:rPr>
+                <w:rFonts w:ascii="Arial" w:hAnsi="Arial" w:cs="Arial"/>
+                <w:b/>
+                <w:sz w:val="15"/>
+                <w:szCs w:val="15"/>
+              </w:rPr>
+            </w:pPr>
+            <w:r>
+              <w:rPr>
+                <w:rFonts w:ascii="Arial" w:hAnsi="Arial" w:cs="Arial"/>
+                <w:b/>
+                <w:sz w:val="15"/>
+                <w:szCs w:val="15"/>
+              </w:rPr>
+              <w:t>V. FRETE</w:t>
+            </w:r>
+          </w:p>
+        </w:tc>
+        <w:tc>
+          <w:tcPr>
+            <w:tcW w:w="1134" w:type="dxa"/>
             <w:gridSpan w:val="3"/>
             <w:shd w:val="clear" w:color="auto" w:fill="F2F2F2" w:themeFill="background1" w:themeFillShade="F2"/>
             <w:vAlign w:val="center"/>
@@ -993,36 +1003,18 @@
               <w:rPr>
                 <w:rFonts w:ascii="Arial" w:hAnsi="Arial" w:cs="Arial"/>
                 <w:b/>
-                <w:sz w:val="16"/>
-                <w:szCs w:val="16"/>
-              </w:rPr>
-            </w:pPr>
-            <w:r>
-              <w:rPr>
-                <w:rFonts w:ascii="Arial" w:hAnsi="Arial" w:cs="Arial"/>
-                <w:b/>
-                <w:sz w:val="16"/>
-                <w:szCs w:val="16"/>
-              </w:rPr>
-              <w:t xml:space="preserve">V. UNIT. </w:t>
-            </w:r>
-            <w:r>
-              <w:rPr>
-                <w:rFonts w:ascii="Arial" w:hAnsi="Arial" w:cs="Arial"/>
-                <w:b/>
-                <w:sz w:val="16"/>
-                <w:szCs w:val="16"/>
-              </w:rPr>
-              <w:t>C</w:t>
-            </w:r>
-            <w:r>
-              <w:rPr>
-                <w:rFonts w:ascii="Arial" w:hAnsi="Arial" w:cs="Arial"/>
-                <w:b/>
-                <w:sz w:val="16"/>
-                <w:szCs w:val="16"/>
-              </w:rPr>
-              <w:t>/IPI</w:t>
+                <w:sz w:val="15"/>
+                <w:szCs w:val="15"/>
+              </w:rPr>
+            </w:pPr>
+            <w:r>
+              <w:rPr>
+                <w:rFonts w:ascii="Arial" w:hAnsi="Arial" w:cs="Arial"/>
+                <w:b/>
+                <w:sz w:val="15"/>
+                <w:szCs w:val="15"/>
+              </w:rPr>
+              <w:t>V. UNIT. C/IPI</w:t>
             </w:r>
           </w:p>
         </w:tc>
@@ -1039,16 +1031,16 @@
               <w:rPr>
                 <w:rFonts w:ascii="Arial" w:hAnsi="Arial" w:cs="Arial"/>
                 <w:b/>
-                <w:sz w:val="16"/>
-                <w:szCs w:val="16"/>
-              </w:rPr>
-            </w:pPr>
-            <w:r>
-              <w:rPr>
-                <w:rFonts w:ascii="Arial" w:hAnsi="Arial" w:cs="Arial"/>
-                <w:b/>
-                <w:sz w:val="16"/>
-                <w:szCs w:val="16"/>
+                <w:sz w:val="15"/>
+                <w:szCs w:val="15"/>
+              </w:rPr>
+            </w:pPr>
+            <w:r>
+              <w:rPr>
+                <w:rFonts w:ascii="Arial" w:hAnsi="Arial" w:cs="Arial"/>
+                <w:b/>
+                <w:sz w:val="15"/>
+                <w:szCs w:val="15"/>
               </w:rPr>
               <w:t>TOTAL</w:t>
             </w:r>
@@ -1071,8 +1063,8 @@
               <w:rPr>
                 <w:rFonts w:ascii="Arial" w:hAnsi="Arial" w:cs="Arial"/>
                 <w:bCs/>
-                <w:sz w:val="16"/>
-                <w:szCs w:val="16"/>
+                <w:sz w:val="15"/>
+                <w:szCs w:val="15"/>
               </w:rPr>
             </w:pPr>
           </w:p>
@@ -1090,8 +1082,8 @@
               <w:rPr>
                 <w:rFonts w:ascii="Arial" w:hAnsi="Arial" w:cs="Arial"/>
                 <w:b/>
-                <w:sz w:val="16"/>
-                <w:szCs w:val="16"/>
+                <w:sz w:val="15"/>
+                <w:szCs w:val="15"/>
               </w:rPr>
             </w:pPr>
           </w:p>
@@ -1109,8 +1101,8 @@
               <w:rPr>
                 <w:rFonts w:ascii="Arial" w:hAnsi="Arial" w:cs="Arial"/>
                 <w:bCs/>
-                <w:sz w:val="16"/>
-                <w:szCs w:val="16"/>
+                <w:sz w:val="15"/>
+                <w:szCs w:val="15"/>
               </w:rPr>
             </w:pPr>
           </w:p>
@@ -1128,8 +1120,8 @@
               <w:rPr>
                 <w:rFonts w:ascii="Arial" w:hAnsi="Arial" w:cs="Arial"/>
                 <w:bCs/>
-                <w:sz w:val="16"/>
-                <w:szCs w:val="16"/>
+                <w:sz w:val="15"/>
+                <w:szCs w:val="15"/>
               </w:rPr>
             </w:pPr>
           </w:p>
@@ -1147,15 +1139,33 @@
               <w:rPr>
                 <w:rFonts w:ascii="Arial" w:hAnsi="Arial" w:cs="Arial"/>
                 <w:bCs/>
-                <w:sz w:val="16"/>
-                <w:szCs w:val="16"/>
-              </w:rPr>
-            </w:pPr>
-          </w:p>
-        </w:tc>
-        <w:tc>
-          <w:tcPr>
-            <w:tcW w:w="2268" w:type="dxa"/>
+                <w:sz w:val="15"/>
+                <w:szCs w:val="15"/>
+              </w:rPr>
+            </w:pPr>
+          </w:p>
+        </w:tc>
+        <w:tc>
+          <w:tcPr>
+            <w:tcW w:w="1134" w:type="dxa"/>
+            <w:vAlign w:val="center"/>
+          </w:tcPr>
+          <w:p>
+            <w:pPr>
+              <w:ind w:left="-129"/>
+              <w:jc w:val="center"/>
+              <w:rPr>
+                <w:rFonts w:ascii="Arial" w:hAnsi="Arial" w:cs="Arial"/>
+                <w:bCs/>
+                <w:sz w:val="15"/>
+                <w:szCs w:val="15"/>
+              </w:rPr>
+            </w:pPr>
+          </w:p>
+        </w:tc>
+        <w:tc>
+          <w:tcPr>
+            <w:tcW w:w="1134" w:type="dxa"/>
             <w:gridSpan w:val="3"/>
             <w:vAlign w:val="center"/>
           </w:tcPr>
@@ -1166,8 +1176,8 @@
               <w:rPr>
                 <w:rFonts w:ascii="Arial" w:hAnsi="Arial" w:cs="Arial"/>
                 <w:bCs/>
-                <w:sz w:val="16"/>
-                <w:szCs w:val="16"/>
+                <w:sz w:val="15"/>
+                <w:szCs w:val="15"/>
               </w:rPr>
             </w:pPr>
           </w:p>
@@ -1184,8 +1194,8 @@
               <w:rPr>
                 <w:rFonts w:ascii="Arial" w:hAnsi="Arial" w:cs="Arial"/>
                 <w:bCs/>
-                <w:sz w:val="16"/>
-                <w:szCs w:val="16"/>
+                <w:sz w:val="15"/>
+                <w:szCs w:val="15"/>
               </w:rPr>
             </w:pPr>
           </w:p>
@@ -1208,8 +1218,8 @@
               <w:rPr>
                 <w:rFonts w:ascii="Arial" w:hAnsi="Arial" w:cs="Arial"/>
                 <w:b/>
-                <w:sz w:val="18"/>
-                <w:szCs w:val="18"/>
+                <w:sz w:val="15"/>
+                <w:szCs w:val="15"/>
               </w:rPr>
             </w:pPr>
           </w:p>
@@ -1217,7 +1227,7 @@
         <w:tc>
           <w:tcPr>
             <w:tcW w:w="2268" w:type="dxa"/>
-            <w:gridSpan w:val="3"/>
+            <w:gridSpan w:val="4"/>
             <w:vAlign w:val="center"/>
           </w:tcPr>
           <w:p>
@@ -1227,16 +1237,16 @@
               <w:rPr>
                 <w:rFonts w:ascii="Arial" w:hAnsi="Arial" w:cs="Arial"/>
                 <w:b/>
-                <w:sz w:val="16"/>
-                <w:szCs w:val="16"/>
-              </w:rPr>
-            </w:pPr>
-            <w:r>
-              <w:rPr>
-                <w:rFonts w:ascii="Arial" w:hAnsi="Arial" w:cs="Arial"/>
-                <w:b/>
-                <w:sz w:val="16"/>
-                <w:szCs w:val="16"/>
+                <w:sz w:val="15"/>
+                <w:szCs w:val="15"/>
+              </w:rPr>
+            </w:pPr>
+            <w:r>
+              <w:rPr>
+                <w:rFonts w:ascii="Arial" w:hAnsi="Arial" w:cs="Arial"/>
+                <w:b/>
+                <w:sz w:val="15"/>
+                <w:szCs w:val="15"/>
               </w:rPr>
               <w:t xml:space="preserve">VALOR TOTAL </w:t>
             </w:r>
@@ -1244,46 +1254,11 @@
               <w:rPr>
                 <w:rFonts w:ascii="Arial" w:hAnsi="Arial" w:cs="Arial"/>
                 <w:b/>
-                <w:sz w:val="16"/>
-                <w:szCs w:val="16"/>
+                <w:sz w:val="15"/>
+                <w:szCs w:val="15"/>
               </w:rPr>
               <w:br/>
-            </w:r>
-            <w:r>
-              <w:rPr>
-                <w:rFonts w:ascii="Arial" w:hAnsi="Arial" w:cs="Arial"/>
-                <w:b/>
-                <w:sz w:val="16"/>
-                <w:szCs w:val="16"/>
-              </w:rPr>
-              <w:t>C</w:t>
-            </w:r>
-            <w:r>
-              <w:rPr>
-                <w:rFonts w:ascii="Arial" w:hAnsi="Arial" w:cs="Arial"/>
-                <w:b/>
-                <w:sz w:val="16"/>
-                <w:szCs w:val="16"/>
-              </w:rPr>
-              <w:t>/DESCONTO</w:t>
-            </w:r>
-            <w:r>
-              <w:rPr>
-                <w:rFonts w:ascii="Arial" w:hAnsi="Arial" w:cs="Arial"/>
-                <w:b/>
-                <w:sz w:val="16"/>
-                <w:szCs w:val="16"/>
-              </w:rPr>
-              <w:t xml:space="preserve"> + IPI</w:t>
-            </w:r>
-            <w:r>
-              <w:rPr>
-                <w:rFonts w:ascii="Arial" w:hAnsi="Arial" w:cs="Arial"/>
-                <w:b/>
-                <w:sz w:val="16"/>
-                <w:szCs w:val="16"/>
-              </w:rPr>
-              <w:t>:</w:t>
+              <w:t>C/DESCONTO + IPI:</w:t>
             </w:r>
           </w:p>
         </w:tc>
@@ -1299,8 +1274,8 @@
               <w:rPr>
                 <w:rFonts w:ascii="Arial" w:hAnsi="Arial" w:cs="Arial"/>
                 <w:bCs/>
-                <w:sz w:val="16"/>
-                <w:szCs w:val="16"/>
+                <w:sz w:val="15"/>
+                <w:szCs w:val="15"/>
               </w:rPr>
             </w:pPr>
           </w:p>
@@ -1313,7 +1288,7 @@
         <w:tc>
           <w:tcPr>
             <w:tcW w:w="11619" w:type="dxa"/>
-            <w:gridSpan w:val="13"/>
+            <w:gridSpan w:val="14"/>
             <w:shd w:val="clear" w:color="auto" w:fill="D9D9D9" w:themeFill="background1" w:themeFillShade="D9"/>
             <w:vAlign w:val="center"/>
           </w:tcPr>
@@ -1347,7 +1322,7 @@
         <w:tc>
           <w:tcPr>
             <w:tcW w:w="11619" w:type="dxa"/>
-            <w:gridSpan w:val="13"/>
+            <w:gridSpan w:val="14"/>
             <w:vAlign w:val="center"/>
           </w:tcPr>
           <w:p>
@@ -1371,7 +1346,7 @@
         <w:tc>
           <w:tcPr>
             <w:tcW w:w="11619" w:type="dxa"/>
-            <w:gridSpan w:val="13"/>
+            <w:gridSpan w:val="14"/>
             <w:shd w:val="clear" w:color="auto" w:fill="F2F2F2" w:themeFill="background1" w:themeFillShade="F2"/>
             <w:vAlign w:val="center"/>
           </w:tcPr>
@@ -1460,7 +1435,7 @@
         <w:tc>
           <w:tcPr>
             <w:tcW w:w="9663" w:type="dxa"/>
-            <w:gridSpan w:val="10"/>
+            <w:gridSpan w:val="11"/>
             <w:vAlign w:val="center"/>
           </w:tcPr>
           <w:p>

</xml_diff>